<commit_message>
cambios en los roles
</commit_message>
<xml_diff>
--- a/Gestión/1.1.2 Documento de registro de definición e identificación del proyecto.docx
+++ b/Gestión/1.1.2 Documento de registro de definición e identificación del proyecto.docx
@@ -869,12 +869,12 @@
                   <wp:extent cx="502920" cy="502920"/>
                   <wp:effectExtent b="0" l="0" r="0" t="0"/>
                   <wp:wrapNone/>
-                  <wp:docPr descr="Código QR con relleno sólido" id="9" name="image1.png"/>
+                  <wp:docPr descr="Código QR con relleno sólido" id="9" name="image4.png"/>
                   <a:graphic>
                     <a:graphicData uri="http://schemas.openxmlformats.org/drawingml/2006/picture">
                       <pic:pic>
                         <pic:nvPicPr>
-                          <pic:cNvPr descr="Código QR con relleno sólido" id="0" name="image1.png"/>
+                          <pic:cNvPr descr="Código QR con relleno sólido" id="0" name="image4.png"/>
                           <pic:cNvPicPr preferRelativeResize="0"/>
                         </pic:nvPicPr>
                         <pic:blipFill>
@@ -1154,12 +1154,12 @@
                 <wp:inline distB="0" distT="0" distL="0" distR="0">
                   <wp:extent cx="503555" cy="503555"/>
                   <wp:effectExtent b="0" l="0" r="0" t="0"/>
-                  <wp:docPr descr="Lista con relleno sólido" id="6" name="image4.png"/>
+                  <wp:docPr descr="Lista con relleno sólido" id="6" name="image1.png"/>
                   <a:graphic>
                     <a:graphicData uri="http://schemas.openxmlformats.org/drawingml/2006/picture">
                       <pic:pic>
                         <pic:nvPicPr>
-                          <pic:cNvPr descr="Lista con relleno sólido" id="0" name="image4.png"/>
+                          <pic:cNvPr descr="Lista con relleno sólido" id="0" name="image1.png"/>
                           <pic:cNvPicPr preferRelativeResize="0"/>
                         </pic:nvPicPr>
                         <pic:blipFill>
@@ -1416,12 +1416,12 @@
                 <wp:inline distB="0" distT="0" distL="0" distR="0">
                   <wp:extent cx="432019" cy="432019"/>
                   <wp:effectExtent b="0" l="0" r="0" t="0"/>
-                  <wp:docPr descr="Inteligencia artificial con relleno sólido" id="5" name="image3.png"/>
+                  <wp:docPr descr="Inteligencia artificial con relleno sólido" id="5" name="image2.png"/>
                   <a:graphic>
                     <a:graphicData uri="http://schemas.openxmlformats.org/drawingml/2006/picture">
                       <pic:pic>
                         <pic:nvPicPr>
-                          <pic:cNvPr descr="Inteligencia artificial con relleno sólido" id="0" name="image3.png"/>
+                          <pic:cNvPr descr="Inteligencia artificial con relleno sólido" id="0" name="image2.png"/>
                           <pic:cNvPicPr preferRelativeResize="0"/>
                         </pic:nvPicPr>
                         <pic:blipFill>
@@ -2736,7 +2736,7 @@
                 <w:szCs w:val="20"/>
                 <w:rtl w:val="0"/>
               </w:rPr>
-              <w:t xml:space="preserve">Back end / Front end/Lider</w:t>
+              <w:t xml:space="preserve">Lider / Fullstack</w:t>
             </w:r>
             <w:r>
               <w:rPr>
@@ -2779,7 +2779,7 @@
                 <w:szCs w:val="20"/>
                 <w:rtl w:val="0"/>
               </w:rPr>
-              <w:t xml:space="preserve">DBA/ Analista Funcional</w:t>
+              <w:t xml:space="preserve">Fullstack</w:t>
             </w:r>
             <w:r>
               <w:rPr>
@@ -2822,7 +2822,7 @@
                 <w:szCs w:val="20"/>
                 <w:rtl w:val="0"/>
               </w:rPr>
-              <w:t xml:space="preserve">Back end/ DevOps</w:t>
+              <w:t xml:space="preserve">Fullstack / DevOps</w:t>
             </w:r>
             <w:r>
               <w:rPr>
@@ -13762,15 +13762,23 @@
                 <w:szCs w:val="18"/>
               </w:rPr>
             </w:pPr>
-            <w:r>
-              <w:rPr>
-                <w:rFonts w:ascii="Calibri" w:cs="Calibri" w:eastAsia="Calibri" w:hAnsi="Calibri"/>
-                <w:color w:val="1f4e79"/>
-                <w:sz w:val="18"/>
-                <w:szCs w:val="18"/>
-                <w:rtl w:val="0"/>
-              </w:rPr>
-              <w:t xml:space="preserve">Github/ Docs</w:t>
+            <w:hyperlink r:id="rId11">
+              <w:r>
+                <w:rPr>
+                  <w:rFonts w:ascii="Calibri" w:cs="Calibri" w:eastAsia="Calibri" w:hAnsi="Calibri"/>
+                  <w:color w:val="1155cc"/>
+                  <w:sz w:val="18"/>
+                  <w:szCs w:val="18"/>
+                  <w:u w:val="single"/>
+                  <w:rtl w:val="0"/>
+                </w:rPr>
+                <w:t xml:space="preserve">Repositorio</w:t>
+              </w:r>
+            </w:hyperlink>
+            <w:r>
+              <w:rPr>
+                <w:rtl w:val="0"/>
+              </w:rPr>
             </w:r>
           </w:p>
         </w:tc>
@@ -13973,7 +13981,7 @@
                 <w:szCs w:val="18"/>
               </w:rPr>
             </w:pPr>
-            <w:hyperlink r:id="rId11">
+            <w:hyperlink r:id="rId12">
               <w:r>
                 <w:rPr>
                   <w:rFonts w:ascii="Calibri" w:cs="Calibri" w:eastAsia="Calibri" w:hAnsi="Calibri"/>
@@ -14172,7 +14180,7 @@
                 <w:szCs w:val="18"/>
               </w:rPr>
             </w:pPr>
-            <w:hyperlink r:id="rId12">
+            <w:hyperlink r:id="rId13">
               <w:r>
                 <w:rPr>
                   <w:rFonts w:ascii="Calibri" w:cs="Calibri" w:eastAsia="Calibri" w:hAnsi="Calibri"/>
@@ -14381,7 +14389,7 @@
               </w:rPr>
               <w:t xml:space="preserve"> </w:t>
             </w:r>
-            <w:hyperlink r:id="rId13">
+            <w:hyperlink r:id="rId14">
               <w:r>
                 <w:rPr>
                   <w:rFonts w:ascii="Calibri" w:cs="Calibri" w:eastAsia="Calibri" w:hAnsi="Calibri"/>
@@ -14404,7 +14412,7 @@
               </w:rPr>
               <w:t xml:space="preserve"> </w:t>
             </w:r>
-            <w:hyperlink r:id="rId14">
+            <w:hyperlink r:id="rId15">
               <w:r>
                 <w:rPr>
                   <w:rFonts w:ascii="Calibri" w:cs="Calibri" w:eastAsia="Calibri" w:hAnsi="Calibri"/>
@@ -14603,7 +14611,7 @@
                 <w:szCs w:val="18"/>
               </w:rPr>
             </w:pPr>
-            <w:hyperlink r:id="rId15">
+            <w:hyperlink r:id="rId16">
               <w:r>
                 <w:rPr>
                   <w:rFonts w:ascii="Calibri" w:cs="Calibri" w:eastAsia="Calibri" w:hAnsi="Calibri"/>
@@ -14802,7 +14810,7 @@
                 <w:szCs w:val="18"/>
               </w:rPr>
             </w:pPr>
-            <w:hyperlink r:id="rId16">
+            <w:hyperlink r:id="rId17">
               <w:r>
                 <w:rPr>
                   <w:rFonts w:ascii="Calibri" w:cs="Calibri" w:eastAsia="Calibri" w:hAnsi="Calibri"/>
@@ -22837,7 +22845,7 @@
     </w:tbl>
     <w:p>
       <w:pPr>
-        <w:spacing w:after="240" w:before="0" w:line="259" w:lineRule="auto"/>
+        <w:spacing w:line="259" w:lineRule="auto"/>
         <w:ind w:left="0" w:firstLine="0"/>
         <w:rPr>
           <w:rFonts w:ascii="Calibri" w:cs="Calibri" w:eastAsia="Calibri" w:hAnsi="Calibri"/>
@@ -22854,9 +22862,10 @@
     </w:p>
     <w:p>
       <w:pPr>
-        <w:spacing w:after="160" w:line="259" w:lineRule="auto"/>
+        <w:spacing w:after="240" w:line="259" w:lineRule="auto"/>
         <w:rPr>
           <w:rFonts w:ascii="Calibri" w:cs="Calibri" w:eastAsia="Calibri" w:hAnsi="Calibri"/>
+          <w:color w:val="548dd4"/>
         </w:rPr>
       </w:pPr>
       <w:r>
@@ -22866,8 +22875,8 @@
       </w:r>
     </w:p>
     <w:sectPr>
-      <w:headerReference r:id="rId17" w:type="default"/>
-      <w:footerReference r:id="rId18" w:type="default"/>
+      <w:headerReference r:id="rId18" w:type="default"/>
+      <w:footerReference r:id="rId19" w:type="default"/>
       <w:pgSz w:h="18720" w:w="12240" w:orient="portrait"/>
       <w:pgMar w:bottom="1417" w:top="1417" w:left="1701" w:right="1701" w:header="708" w:footer="1202"/>
       <w:pgNumType w:start="1"/>
@@ -23155,12 +23164,12 @@
         <wp:inline distB="0" distT="0" distL="0" distR="0">
           <wp:extent cx="1869144" cy="498662"/>
           <wp:effectExtent b="0" l="0" r="0" t="0"/>
-          <wp:docPr descr="Texto&#10;&#10;Descripción generada automáticamente con confianza media" id="7" name="image5.jpg"/>
+          <wp:docPr descr="Texto&#10;&#10;Descripción generada automáticamente con confianza media" id="7" name="image3.jpg"/>
           <a:graphic>
             <a:graphicData uri="http://schemas.openxmlformats.org/drawingml/2006/picture">
               <pic:pic>
                 <pic:nvPicPr>
-                  <pic:cNvPr descr="Texto&#10;&#10;Descripción generada automáticamente con confianza media" id="0" name="image5.jpg"/>
+                  <pic:cNvPr descr="Texto&#10;&#10;Descripción generada automáticamente con confianza media" id="0" name="image3.jpg"/>
                   <pic:cNvPicPr preferRelativeResize="0"/>
                 </pic:nvPicPr>
                 <pic:blipFill>
@@ -23217,12 +23226,12 @@
           <wp:extent cx="1873250" cy="373380"/>
           <wp:effectExtent b="0" l="0" r="0" t="0"/>
           <wp:wrapSquare wrapText="bothSides" distB="0" distT="0" distL="114300" distR="114300"/>
-          <wp:docPr id="8" name="image2.png"/>
+          <wp:docPr id="8" name="image5.png"/>
           <a:graphic>
             <a:graphicData uri="http://schemas.openxmlformats.org/drawingml/2006/picture">
               <pic:pic>
                 <pic:nvPicPr>
-                  <pic:cNvPr id="0" name="image2.png"/>
+                  <pic:cNvPr id="0" name="image5.png"/>
                   <pic:cNvPicPr preferRelativeResize="0"/>
                 </pic:nvPicPr>
                 <pic:blipFill>

</xml_diff>